<commit_message>
docs: quito nota de IA y compacto espacios en blanco del informe
- Elimina la nota gris de la seccion de declaracion de IA
- Elimina parrafos vacios del cuerpo para juntar las secciones
  (caratula con logo preservada intacta)
</commit_message>
<xml_diff>
--- a/informe/Informe_EcoMarket.docx
+++ b/informe/Informe_EcoMarket.docx
@@ -329,42 +329,6 @@
     </w:p>
     <w:p>
       <w:pPr>
-        <w:spacing w:after="264" w:line="259" w:lineRule="auto"/>
-        <w:ind w:left="0" w:firstLine="0"/>
-      </w:pPr>
-      <w:r>
-        <w:t xml:space="preserve"> </w:t>
-      </w:r>
-    </w:p>
-    <w:p>
-      <w:pPr>
-        <w:spacing w:after="264" w:line="259" w:lineRule="auto"/>
-        <w:ind w:left="0" w:firstLine="0"/>
-      </w:pPr>
-      <w:r>
-        <w:t xml:space="preserve"> </w:t>
-      </w:r>
-    </w:p>
-    <w:p>
-      <w:pPr>
-        <w:spacing w:after="264" w:line="259" w:lineRule="auto"/>
-        <w:ind w:left="0" w:firstLine="0"/>
-      </w:pPr>
-      <w:r>
-        <w:t xml:space="preserve"> </w:t>
-      </w:r>
-    </w:p>
-    <w:p>
-      <w:pPr>
-        <w:spacing w:after="0" w:line="259" w:lineRule="auto"/>
-        <w:ind w:left="0" w:firstLine="0"/>
-      </w:pPr>
-      <w:r>
-        <w:t xml:space="preserve"> </w:t>
-      </w:r>
-    </w:p>
-    <w:p>
-      <w:pPr>
         <w:pStyle w:val="Ttulo1"/>
         <w:spacing w:after="238"/>
         <w:ind w:left="485" w:hanging="500"/>
@@ -459,24 +423,6 @@
     </w:p>
     <w:p>
       <w:pPr>
-        <w:spacing w:after="264" w:line="259" w:lineRule="auto"/>
-        <w:ind w:left="0" w:firstLine="0"/>
-      </w:pPr>
-      <w:r>
-        <w:t xml:space="preserve"> </w:t>
-      </w:r>
-    </w:p>
-    <w:p>
-      <w:pPr>
-        <w:spacing w:after="0" w:line="259" w:lineRule="auto"/>
-        <w:ind w:left="0" w:firstLine="0"/>
-      </w:pPr>
-      <w:r>
-        <w:t xml:space="preserve"> </w:t>
-      </w:r>
-    </w:p>
-    <w:p>
-      <w:pPr>
         <w:pStyle w:val="Ttulo1"/>
         <w:ind w:left="485" w:hanging="500"/>
       </w:pPr>
@@ -530,24 +476,6 @@
       </w:pPr>
       <w:r>
         <w:t xml:space="preserve">En conjunto, estas decisiones permitieron obtener una aplicación organizada, donde cada componente cumple una responsabilidad específica y la comunicación entre el frontend y el backend se realiza de manera ordenada mediante una API REST. </w:t>
-      </w:r>
-    </w:p>
-    <w:p>
-      <w:pPr>
-        <w:spacing w:after="264" w:line="259" w:lineRule="auto"/>
-        <w:ind w:left="0" w:firstLine="0"/>
-      </w:pPr>
-      <w:r>
-        <w:t xml:space="preserve"> </w:t>
-      </w:r>
-    </w:p>
-    <w:p>
-      <w:pPr>
-        <w:spacing w:after="0" w:line="259" w:lineRule="auto"/>
-        <w:ind w:left="0" w:firstLine="0"/>
-      </w:pPr>
-      <w:r>
-        <w:t xml:space="preserve"> </w:t>
       </w:r>
     </w:p>
     <w:p>
@@ -850,96 +778,6 @@
       </w:pPr>
       <w:r>
         <w:t xml:space="preserve">Esta organización permitió mantener una estructura clara durante todo el desarrollo del proyecto y facilitó tanto la reutilización del código como el mantenimiento de las distintas funcionalidades implementadas. </w:t>
-      </w:r>
-    </w:p>
-    <w:p>
-      <w:pPr>
-        <w:spacing w:after="264" w:line="259" w:lineRule="auto"/>
-        <w:ind w:left="0" w:firstLine="0"/>
-      </w:pPr>
-      <w:r>
-        <w:t xml:space="preserve"> </w:t>
-      </w:r>
-    </w:p>
-    <w:p>
-      <w:pPr>
-        <w:spacing w:after="264" w:line="259" w:lineRule="auto"/>
-        <w:ind w:left="0" w:firstLine="0"/>
-      </w:pPr>
-      <w:r>
-        <w:t xml:space="preserve"> </w:t>
-      </w:r>
-    </w:p>
-    <w:p>
-      <w:pPr>
-        <w:spacing w:after="264" w:line="259" w:lineRule="auto"/>
-        <w:ind w:left="0" w:firstLine="0"/>
-      </w:pPr>
-      <w:r>
-        <w:t xml:space="preserve"> </w:t>
-      </w:r>
-    </w:p>
-    <w:p>
-      <w:pPr>
-        <w:spacing w:after="264" w:line="259" w:lineRule="auto"/>
-        <w:ind w:left="0" w:firstLine="0"/>
-      </w:pPr>
-      <w:r>
-        <w:t xml:space="preserve"> </w:t>
-      </w:r>
-    </w:p>
-    <w:p>
-      <w:pPr>
-        <w:spacing w:after="269" w:line="259" w:lineRule="auto"/>
-        <w:ind w:left="0" w:firstLine="0"/>
-      </w:pPr>
-      <w:r>
-        <w:t xml:space="preserve"> </w:t>
-      </w:r>
-    </w:p>
-    <w:p>
-      <w:pPr>
-        <w:spacing w:after="264" w:line="259" w:lineRule="auto"/>
-        <w:ind w:left="0" w:firstLine="0"/>
-      </w:pPr>
-      <w:r>
-        <w:t xml:space="preserve"> </w:t>
-      </w:r>
-    </w:p>
-    <w:p>
-      <w:pPr>
-        <w:spacing w:after="264" w:line="259" w:lineRule="auto"/>
-        <w:ind w:left="0" w:firstLine="0"/>
-      </w:pPr>
-      <w:r>
-        <w:t xml:space="preserve"> </w:t>
-      </w:r>
-    </w:p>
-    <w:p>
-      <w:pPr>
-        <w:spacing w:after="264" w:line="259" w:lineRule="auto"/>
-        <w:ind w:left="0" w:firstLine="0"/>
-      </w:pPr>
-      <w:r>
-        <w:t xml:space="preserve"> </w:t>
-      </w:r>
-    </w:p>
-    <w:p>
-      <w:pPr>
-        <w:spacing w:after="264" w:line="259" w:lineRule="auto"/>
-        <w:ind w:left="0" w:firstLine="0"/>
-      </w:pPr>
-      <w:r>
-        <w:t xml:space="preserve"> </w:t>
-      </w:r>
-    </w:p>
-    <w:p>
-      <w:pPr>
-        <w:spacing w:after="0" w:line="259" w:lineRule="auto"/>
-        <w:ind w:left="0" w:firstLine="0"/>
-      </w:pPr>
-      <w:r>
-        <w:t xml:space="preserve"> </w:t>
       </w:r>
     </w:p>
     <w:p>
@@ -2423,14 +2261,6 @@
         <w:ind w:left="-5"/>
       </w:pPr>
       <w:r>
-        <w:t xml:space="preserve"> </w:t>
-      </w:r>
-    </w:p>
-    <w:p>
-      <w:pPr>
-        <w:ind w:left="-5"/>
-      </w:pPr>
-      <w:r>
         <w:t xml:space="preserve">Antes de integrar el frontend, todos los endpoints fueron probados con Postman. La colección utilizada se incluye en el repositorio del proyecto.</w:t>
       </w:r>
     </w:p>
@@ -2523,18 +2353,6 @@
     </w:p>
     <w:p>
       <w:pPr>
-        <w:ind w:left="-5"/>
-      </w:pPr>
-      <w:r>
-        <w:rPr>
-          <w:i/>
-          <w:color w:val="808080"/>
-        </w:rPr>
-        <w:t xml:space="preserve">Nota: ajustar esta declaración según las herramientas efectivamente utilizadas por el grupo (por ejemplo, ChatGPT, GitHub Copilot o Claude).</w:t>
-      </w:r>
-    </w:p>
-    <w:p>
-      <w:pPr>
         <w:pStyle w:val="Ttulo1"/>
         <w:ind w:left="484" w:hanging="499"/>
       </w:pPr>
@@ -2580,33 +2398,6 @@
       </w:pPr>
       <w:r>
         <w:t xml:space="preserve">En términos generales, EcoMarket representó una oportunidad para desarrollar una aplicación completa aplicando tecnologías ampliamente utilizadas en el desarrollo web actual y poniendo en práctica criterios de organización, mantenimiento y diseño de software que resultan fundamentales en proyectos de mayor escala. </w:t>
-      </w:r>
-    </w:p>
-    <w:p>
-      <w:pPr>
-        <w:spacing w:after="264" w:line="259" w:lineRule="auto"/>
-        <w:ind w:left="0" w:firstLine="0"/>
-      </w:pPr>
-      <w:r>
-        <w:t xml:space="preserve"> </w:t>
-      </w:r>
-    </w:p>
-    <w:p>
-      <w:pPr>
-        <w:spacing w:after="264" w:line="259" w:lineRule="auto"/>
-        <w:ind w:left="0" w:firstLine="0"/>
-      </w:pPr>
-      <w:r>
-        <w:t xml:space="preserve"> </w:t>
-      </w:r>
-    </w:p>
-    <w:p>
-      <w:pPr>
-        <w:spacing w:after="0" w:line="259" w:lineRule="auto"/>
-        <w:ind w:left="0" w:firstLine="0"/>
-      </w:pPr>
-      <w:r>
-        <w:t xml:space="preserve"> </w:t>
       </w:r>
     </w:p>
     <w:p>

</xml_diff>